<commit_message>
more results from PVsyst
</commit_message>
<xml_diff>
--- a/Documentation/25_10_07.docx
+++ b/Documentation/25_10_07.docx
@@ -220,7 +220,6 @@
           <w:lang w:val="en-AU"/>
         </w:rPr>
       </w:pPr>
-      <w:proofErr w:type="gramStart"/>
       <w:r>
         <w:rPr>
           <w:lang w:val="en-AU"/>
@@ -228,7 +227,6 @@
         <w:lastRenderedPageBreak/>
         <w:t>Original,  ok</w:t>
       </w:r>
-      <w:proofErr w:type="gramEnd"/>
       <w:r>
         <w:rPr>
           <w:noProof/>
@@ -354,19 +352,11 @@
           <w:lang w:val="en-AU"/>
         </w:rPr>
       </w:pPr>
-      <w:proofErr w:type="gramStart"/>
-      <w:r>
-        <w:rPr>
-          <w:lang w:val="en-AU"/>
-        </w:rPr>
-        <w:t>So</w:t>
-      </w:r>
-      <w:proofErr w:type="gramEnd"/>
-      <w:r>
-        <w:rPr>
-          <w:lang w:val="en-AU"/>
-        </w:rPr>
-        <w:t xml:space="preserve"> the problem comes from the weather file</w:t>
+      <w:r>
+        <w:rPr>
+          <w:lang w:val="en-AU"/>
+        </w:rPr>
+        <w:t>So the problem comes from the weather file</w:t>
       </w:r>
     </w:p>
     <w:p>
@@ -887,21 +877,7 @@
         <w:rPr>
           <w:lang w:val="en-AU"/>
         </w:rPr>
-        <w:t xml:space="preserve">Bad </w:t>
-      </w:r>
-      <w:proofErr w:type="spellStart"/>
-      <w:r>
-        <w:rPr>
-          <w:lang w:val="en-AU"/>
-        </w:rPr>
-        <w:t>dni</w:t>
-      </w:r>
-      <w:proofErr w:type="spellEnd"/>
-      <w:r>
-        <w:rPr>
-          <w:lang w:val="en-AU"/>
-        </w:rPr>
-        <w:t xml:space="preserve"> as </w:t>
+        <w:t xml:space="preserve">Bad dni as </w:t>
       </w:r>
       <w:r>
         <w:rPr>
@@ -925,35 +901,7 @@
         <w:rPr>
           <w:lang w:val="en-AU"/>
         </w:rPr>
-        <w:t xml:space="preserve">Try weather with same </w:t>
-      </w:r>
-      <w:proofErr w:type="spellStart"/>
-      <w:r>
-        <w:rPr>
-          <w:lang w:val="en-AU"/>
-        </w:rPr>
-        <w:t>ghi</w:t>
-      </w:r>
-      <w:proofErr w:type="spellEnd"/>
-      <w:r>
-        <w:rPr>
-          <w:lang w:val="en-AU"/>
-        </w:rPr>
-        <w:t xml:space="preserve"> and </w:t>
-      </w:r>
-      <w:proofErr w:type="spellStart"/>
-      <w:r>
-        <w:rPr>
-          <w:lang w:val="en-AU"/>
-        </w:rPr>
-        <w:t>dni</w:t>
-      </w:r>
-      <w:proofErr w:type="spellEnd"/>
-      <w:r>
-        <w:rPr>
-          <w:lang w:val="en-AU"/>
-        </w:rPr>
-        <w:t xml:space="preserve"> end</w:t>
+        <w:t>Try weather with same ghi and dni end</w:t>
       </w:r>
     </w:p>
     <w:p>
@@ -971,16 +919,8 @@
         <w:rPr>
           <w:lang w:val="en-AU"/>
         </w:rPr>
-        <w:t xml:space="preserve">Bad </w:t>
-      </w:r>
-      <w:proofErr w:type="spellStart"/>
-      <w:r>
-        <w:rPr>
-          <w:lang w:val="en-AU"/>
-        </w:rPr>
-        <w:t>dhi</w:t>
-      </w:r>
-      <w:proofErr w:type="spellEnd"/>
+        <w:t>Bad dhi</w:t>
+      </w:r>
     </w:p>
     <w:p>
       <w:pPr>
@@ -997,30 +937,8 @@
         <w:rPr>
           <w:lang w:val="en-AU"/>
         </w:rPr>
-        <w:t xml:space="preserve">Try with </w:t>
-      </w:r>
-      <w:proofErr w:type="spellStart"/>
-      <w:r>
-        <w:rPr>
-          <w:lang w:val="en-AU"/>
-        </w:rPr>
-        <w:t>dni</w:t>
-      </w:r>
-      <w:proofErr w:type="spellEnd"/>
-      <w:r>
-        <w:rPr>
-          <w:lang w:val="en-AU"/>
-        </w:rPr>
-        <w:t xml:space="preserve"> and </w:t>
-      </w:r>
-      <w:proofErr w:type="spellStart"/>
-      <w:r>
-        <w:rPr>
-          <w:lang w:val="en-AU"/>
-        </w:rPr>
-        <w:t>dhi</w:t>
-      </w:r>
-      <w:proofErr w:type="spellEnd"/>
+        <w:t>Try with dni and dhi</w:t>
+      </w:r>
       <w:r>
         <w:rPr>
           <w:lang w:val="en-AU"/>
@@ -1045,33 +963,11 @@
         </w:rPr>
         <w:t xml:space="preserve">Try </w:t>
       </w:r>
-      <w:proofErr w:type="spellStart"/>
-      <w:r>
-        <w:rPr>
-          <w:lang w:val="en-AU"/>
-        </w:rPr>
-        <w:t>ghi</w:t>
-      </w:r>
-      <w:proofErr w:type="spellEnd"/>
-      <w:r>
-        <w:rPr>
-          <w:lang w:val="en-AU"/>
-        </w:rPr>
-        <w:t xml:space="preserve"> and </w:t>
-      </w:r>
-      <w:proofErr w:type="spellStart"/>
-      <w:r>
-        <w:rPr>
-          <w:lang w:val="en-AU"/>
-        </w:rPr>
-        <w:t>dni</w:t>
-      </w:r>
-      <w:proofErr w:type="spellEnd"/>
-      <w:r>
-        <w:rPr>
-          <w:lang w:val="en-AU"/>
-        </w:rPr>
-        <w:t xml:space="preserve"> ins</w:t>
+      <w:r>
+        <w:rPr>
+          <w:lang w:val="en-AU"/>
+        </w:rPr>
+        <w:t>ghi and dni ins</w:t>
       </w:r>
     </w:p>
     <w:p>
@@ -1090,35 +986,7 @@
           <w:lang w:val="en-AU"/>
         </w:rPr>
         <w:lastRenderedPageBreak/>
-        <w:t xml:space="preserve">Th best is </w:t>
-      </w:r>
-      <w:proofErr w:type="spellStart"/>
-      <w:r>
-        <w:rPr>
-          <w:lang w:val="en-AU"/>
-        </w:rPr>
-        <w:t>ghi</w:t>
-      </w:r>
-      <w:proofErr w:type="spellEnd"/>
-      <w:r>
-        <w:rPr>
-          <w:lang w:val="en-AU"/>
-        </w:rPr>
-        <w:t xml:space="preserve">, </w:t>
-      </w:r>
-      <w:proofErr w:type="spellStart"/>
-      <w:r>
-        <w:rPr>
-          <w:lang w:val="en-AU"/>
-        </w:rPr>
-        <w:t>dni</w:t>
-      </w:r>
-      <w:proofErr w:type="spellEnd"/>
-      <w:r>
-        <w:rPr>
-          <w:lang w:val="en-AU"/>
-        </w:rPr>
-        <w:t xml:space="preserve"> with ins</w:t>
+        <w:t>Th best is ghi, dni with ins</w:t>
       </w:r>
     </w:p>
     <w:p>
@@ -1937,19 +1805,11 @@
           <w:lang w:val="en-AU"/>
         </w:rPr>
       </w:pPr>
-      <w:proofErr w:type="gramStart"/>
-      <w:r>
-        <w:rPr>
-          <w:lang w:val="en-AU"/>
-        </w:rPr>
-        <w:t>No</w:t>
-      </w:r>
-      <w:proofErr w:type="gramEnd"/>
-      <w:r>
-        <w:rPr>
-          <w:lang w:val="en-AU"/>
-        </w:rPr>
-        <w:t xml:space="preserve"> it does not</w:t>
+      <w:r>
+        <w:rPr>
+          <w:lang w:val="en-AU"/>
+        </w:rPr>
+        <w:t>No it does not</w:t>
       </w:r>
     </w:p>
     <w:p>
@@ -1985,27 +1845,13 @@
         <w:rPr>
           <w:lang w:val="en-AU"/>
         </w:rPr>
-        <w:t xml:space="preserve">Try to improve the performance for the </w:t>
-      </w:r>
-      <w:proofErr w:type="gramStart"/>
-      <w:r>
-        <w:rPr>
-          <w:lang w:val="en-AU"/>
-        </w:rPr>
-        <w:t xml:space="preserve">Year </w:t>
-      </w:r>
-      <w:r>
-        <w:rPr>
-          <w:lang w:val="en-AU"/>
-        </w:rPr>
-        <w:t>:</w:t>
-      </w:r>
-      <w:proofErr w:type="gramEnd"/>
-      <w:r>
-        <w:rPr>
-          <w:lang w:val="en-AU"/>
-        </w:rPr>
-        <w:t xml:space="preserve"> 0.766 (worse)</w:t>
+        <w:t xml:space="preserve">Try to improve the performance for the Year </w:t>
+      </w:r>
+      <w:r>
+        <w:rPr>
+          <w:lang w:val="en-AU"/>
+        </w:rPr>
+        <w:t>: 0.766 (worse)</w:t>
       </w:r>
     </w:p>
     <w:p>
@@ -2216,21 +2062,7 @@
         <w:rPr>
           <w:lang w:val="en-AU"/>
         </w:rPr>
-        <w:t xml:space="preserve">Try to improve the performance for the </w:t>
-      </w:r>
-      <w:proofErr w:type="gramStart"/>
-      <w:r>
-        <w:rPr>
-          <w:lang w:val="en-AU"/>
-        </w:rPr>
-        <w:t>Year :</w:t>
-      </w:r>
-      <w:proofErr w:type="gramEnd"/>
-      <w:r>
-        <w:rPr>
-          <w:lang w:val="en-AU"/>
-        </w:rPr>
-        <w:t xml:space="preserve"> </w:t>
+        <w:t xml:space="preserve">Try to improve the performance for the Year : </w:t>
       </w:r>
       <w:r>
         <w:rPr>
@@ -2447,16 +2279,8 @@
         <w:rPr>
           <w:lang w:val="en-AU"/>
         </w:rPr>
-        <w:t xml:space="preserve">Try to improve the performance for the </w:t>
-      </w:r>
-      <w:proofErr w:type="gramStart"/>
-      <w:r>
-        <w:rPr>
-          <w:lang w:val="en-AU"/>
-        </w:rPr>
-        <w:t>Year :</w:t>
-      </w:r>
-      <w:proofErr w:type="gramEnd"/>
+        <w:t>Try to improve the performance for the Year :</w:t>
+      </w:r>
       <w:r>
         <w:rPr>
           <w:lang w:val="en-AU"/>
@@ -2679,21 +2503,7 @@
         <w:rPr>
           <w:lang w:val="en-AU"/>
         </w:rPr>
-        <w:t xml:space="preserve">Try to improve the performance for the </w:t>
-      </w:r>
-      <w:proofErr w:type="gramStart"/>
-      <w:r>
-        <w:rPr>
-          <w:lang w:val="en-AU"/>
-        </w:rPr>
-        <w:t>Year :</w:t>
-      </w:r>
-      <w:proofErr w:type="gramEnd"/>
-      <w:r>
-        <w:rPr>
-          <w:lang w:val="en-AU"/>
-        </w:rPr>
-        <w:t xml:space="preserve"> 0.74</w:t>
+        <w:t>Try to improve the performance for the Year : 0.74</w:t>
       </w:r>
       <w:r>
         <w:rPr>
@@ -4939,19 +4749,11 @@
           <w:lang w:val="en-AU"/>
         </w:rPr>
       </w:pPr>
-      <w:proofErr w:type="spellStart"/>
-      <w:r>
-        <w:rPr>
-          <w:lang w:val="en-AU"/>
-        </w:rPr>
-        <w:t>Mmod</w:t>
-      </w:r>
-      <w:proofErr w:type="spellEnd"/>
-      <w:r>
-        <w:rPr>
-          <w:lang w:val="en-AU"/>
-        </w:rPr>
-        <w:t>=11.38 kg/m3 (from datasheet)</w:t>
+      <w:r>
+        <w:rPr>
+          <w:lang w:val="en-AU"/>
+        </w:rPr>
+        <w:t>Mmod=11.38 kg/m3 (from datasheet)</w:t>
       </w:r>
     </w:p>
     <w:p>
@@ -5278,19 +5080,11 @@
           <w:lang w:val="en-AU"/>
         </w:rPr>
       </w:pPr>
-      <w:proofErr w:type="spellStart"/>
-      <w:r>
-        <w:rPr>
-          <w:lang w:val="en-AU"/>
-        </w:rPr>
-        <w:t>Mmod</w:t>
-      </w:r>
-      <w:proofErr w:type="spellEnd"/>
-      <w:r>
-        <w:rPr>
-          <w:lang w:val="en-AU"/>
-        </w:rPr>
-        <w:t>=11.38 kg/m3 (from datasheet)</w:t>
+      <w:r>
+        <w:rPr>
+          <w:lang w:val="en-AU"/>
+        </w:rPr>
+        <w:t>Mmod=11.38 kg/m3 (from datasheet)</w:t>
       </w:r>
     </w:p>
     <w:p>
@@ -5622,19 +5416,11 @@
           <w:lang w:val="en-AU"/>
         </w:rPr>
       </w:pPr>
-      <w:proofErr w:type="spellStart"/>
-      <w:r>
-        <w:rPr>
-          <w:lang w:val="en-AU"/>
-        </w:rPr>
-        <w:t>Mmod</w:t>
-      </w:r>
-      <w:proofErr w:type="spellEnd"/>
-      <w:r>
-        <w:rPr>
-          <w:lang w:val="en-AU"/>
-        </w:rPr>
-        <w:t>=11.38 kg/m3 (from datasheet)</w:t>
+      <w:r>
+        <w:rPr>
+          <w:lang w:val="en-AU"/>
+        </w:rPr>
+        <w:t>Mmod=11.38 kg/m3 (from datasheet)</w:t>
       </w:r>
     </w:p>
     <w:p>
@@ -5991,19 +5777,11 @@
           <w:lang w:val="en-AU"/>
         </w:rPr>
       </w:pPr>
-      <w:proofErr w:type="spellStart"/>
-      <w:r>
-        <w:rPr>
-          <w:lang w:val="en-AU"/>
-        </w:rPr>
-        <w:t>Mmod</w:t>
-      </w:r>
-      <w:proofErr w:type="spellEnd"/>
-      <w:r>
-        <w:rPr>
-          <w:lang w:val="en-AU"/>
-        </w:rPr>
-        <w:t>=11.38 kg/m3 (from datasheet)</w:t>
+      <w:r>
+        <w:rPr>
+          <w:lang w:val="en-AU"/>
+        </w:rPr>
+        <w:t>Mmod=11.38 kg/m3 (from datasheet)</w:t>
       </w:r>
     </w:p>
     <w:p>
@@ -6347,19 +6125,11 @@
           <w:lang w:val="en-AU"/>
         </w:rPr>
       </w:pPr>
-      <w:proofErr w:type="spellStart"/>
-      <w:r>
-        <w:rPr>
-          <w:lang w:val="en-AU"/>
-        </w:rPr>
-        <w:t>Mmod</w:t>
-      </w:r>
-      <w:proofErr w:type="spellEnd"/>
-      <w:r>
-        <w:rPr>
-          <w:lang w:val="en-AU"/>
-        </w:rPr>
-        <w:t>=11.38 kg/m3 (from datasheet)</w:t>
+      <w:r>
+        <w:rPr>
+          <w:lang w:val="en-AU"/>
+        </w:rPr>
+        <w:t>Mmod=11.38 kg/m3 (from datasheet)</w:t>
       </w:r>
     </w:p>
     <w:p>
@@ -6762,19 +6532,11 @@
           <w:lang w:val="en-AU"/>
         </w:rPr>
       </w:pPr>
-      <w:proofErr w:type="spellStart"/>
-      <w:r>
-        <w:rPr>
-          <w:lang w:val="en-AU"/>
-        </w:rPr>
-        <w:t>Mmod</w:t>
-      </w:r>
-      <w:proofErr w:type="spellEnd"/>
-      <w:r>
-        <w:rPr>
-          <w:lang w:val="en-AU"/>
-        </w:rPr>
-        <w:t>=11.38 kg/m3 (from datasheet)</w:t>
+      <w:r>
+        <w:rPr>
+          <w:lang w:val="en-AU"/>
+        </w:rPr>
+        <w:t>Mmod=11.38 kg/m3 (from datasheet)</w:t>
       </w:r>
     </w:p>
     <w:p>
@@ -6836,19 +6598,11 @@
         </w:rPr>
         <w:t xml:space="preserve">Include heat flow to ground (15, </w:t>
       </w:r>
-      <w:proofErr w:type="spellStart"/>
-      <w:r>
-        <w:rPr>
-          <w:lang w:val="en-AU"/>
-        </w:rPr>
-        <w:t>Tamb</w:t>
-      </w:r>
-      <w:proofErr w:type="spellEnd"/>
-      <w:r>
-        <w:rPr>
-          <w:lang w:val="en-AU"/>
-        </w:rPr>
-        <w:t>) (optimised)</w:t>
+      <w:r>
+        <w:rPr>
+          <w:lang w:val="en-AU"/>
+        </w:rPr>
+        <w:t>Tamb) (optimised)</w:t>
       </w:r>
     </w:p>
     <w:p>
@@ -7030,21 +6784,7 @@
         <w:rPr>
           <w:lang w:val="en-AU"/>
         </w:rPr>
-        <w:t xml:space="preserve">Change the </w:t>
-      </w:r>
-      <w:proofErr w:type="spellStart"/>
-      <w:r>
-        <w:rPr>
-          <w:lang w:val="en-AU"/>
-        </w:rPr>
-        <w:t>color</w:t>
-      </w:r>
-      <w:proofErr w:type="spellEnd"/>
-      <w:r>
-        <w:rPr>
-          <w:lang w:val="en-AU"/>
-        </w:rPr>
-        <w:t xml:space="preserve"> to see which one is better</w:t>
+        <w:t>Change the color to see which one is better</w:t>
       </w:r>
     </w:p>
     <w:p>
@@ -7197,35 +6937,7 @@
           <w:lang w:val="en-AU"/>
         </w:rPr>
         <w:lastRenderedPageBreak/>
-        <w:t xml:space="preserve">Try </w:t>
-      </w:r>
-      <w:proofErr w:type="spellStart"/>
-      <w:r>
-        <w:rPr>
-          <w:lang w:val="en-AU"/>
-        </w:rPr>
-        <w:t>dni</w:t>
-      </w:r>
-      <w:proofErr w:type="spellEnd"/>
-      <w:r>
-        <w:rPr>
-          <w:lang w:val="en-AU"/>
-        </w:rPr>
-        <w:t xml:space="preserve"> </w:t>
-      </w:r>
-      <w:proofErr w:type="spellStart"/>
-      <w:r>
-        <w:rPr>
-          <w:lang w:val="en-AU"/>
-        </w:rPr>
-        <w:t>ghi</w:t>
-      </w:r>
-      <w:proofErr w:type="spellEnd"/>
-      <w:r>
-        <w:rPr>
-          <w:lang w:val="en-AU"/>
-        </w:rPr>
-        <w:t xml:space="preserve"> and </w:t>
+        <w:t xml:space="preserve">Try dni ghi and </w:t>
       </w:r>
       <w:r>
         <w:rPr>
@@ -7524,19 +7236,11 @@
           <w:lang w:val="en-AU"/>
         </w:rPr>
       </w:pPr>
-      <w:proofErr w:type="spellStart"/>
-      <w:r>
-        <w:rPr>
-          <w:lang w:val="en-AU"/>
-        </w:rPr>
-        <w:t>Mmod</w:t>
-      </w:r>
-      <w:proofErr w:type="spellEnd"/>
-      <w:r>
-        <w:rPr>
-          <w:lang w:val="en-AU"/>
-        </w:rPr>
-        <w:t xml:space="preserve">=11.38 kg/m3 </w:t>
+      <w:r>
+        <w:rPr>
+          <w:lang w:val="en-AU"/>
+        </w:rPr>
+        <w:t xml:space="preserve">Mmod=11.38 kg/m3 </w:t>
       </w:r>
     </w:p>
     <w:p>
@@ -7591,21 +7295,7 @@
         <w:rPr>
           <w:lang w:val="en-AU"/>
         </w:rPr>
-        <w:t xml:space="preserve">Include heat flow to ground (15, </w:t>
-      </w:r>
-      <w:proofErr w:type="spellStart"/>
-      <w:r>
-        <w:rPr>
-          <w:lang w:val="en-AU"/>
-        </w:rPr>
-        <w:t>Tamb</w:t>
-      </w:r>
-      <w:proofErr w:type="spellEnd"/>
-      <w:r>
-        <w:rPr>
-          <w:lang w:val="en-AU"/>
-        </w:rPr>
-        <w:t>)</w:t>
+        <w:t>Include heat flow to ground (15, Tamb)</w:t>
       </w:r>
     </w:p>
     <w:p>
@@ -8682,21 +8372,7 @@
         <w:rPr>
           <w:lang w:val="en-AU"/>
         </w:rPr>
-        <w:t xml:space="preserve">The results show that the transient will make it worse, even though reducing the </w:t>
-      </w:r>
-      <w:proofErr w:type="spellStart"/>
-      <w:r>
-        <w:rPr>
-          <w:lang w:val="en-AU"/>
-        </w:rPr>
-        <w:t>cmod</w:t>
-      </w:r>
-      <w:proofErr w:type="spellEnd"/>
-      <w:r>
-        <w:rPr>
-          <w:lang w:val="en-AU"/>
-        </w:rPr>
-        <w:t xml:space="preserve"> will make it match better, it still worse than without transient at all</w:t>
+        <w:t>The results show that the transient will make it worse, even though reducing the cmod will make it match better, it still worse than without transient at all</w:t>
       </w:r>
     </w:p>
     <w:p>
@@ -9529,19 +9205,11 @@
           <w:lang w:val="en-AU"/>
         </w:rPr>
       </w:pPr>
-      <w:proofErr w:type="gramStart"/>
-      <w:r>
-        <w:rPr>
-          <w:lang w:val="en-AU"/>
-        </w:rPr>
-        <w:t>So</w:t>
-      </w:r>
-      <w:proofErr w:type="gramEnd"/>
-      <w:r>
-        <w:rPr>
-          <w:lang w:val="en-AU"/>
-        </w:rPr>
-        <w:t xml:space="preserve"> the best option is to remove it</w:t>
+      <w:r>
+        <w:rPr>
+          <w:lang w:val="en-AU"/>
+        </w:rPr>
+        <w:t>So the best option is to remove it</w:t>
       </w:r>
     </w:p>
     <w:p>
@@ -9859,19 +9527,11 @@
           <w:lang w:val="en-AU"/>
         </w:rPr>
       </w:pPr>
-      <w:proofErr w:type="spellStart"/>
-      <w:r>
-        <w:rPr>
-          <w:lang w:val="en-AU"/>
-        </w:rPr>
-        <w:t>Uv</w:t>
-      </w:r>
-      <w:proofErr w:type="spellEnd"/>
-      <w:r>
-        <w:rPr>
-          <w:lang w:val="en-AU"/>
-        </w:rPr>
-        <w:t>=1</w:t>
+      <w:r>
+        <w:rPr>
+          <w:lang w:val="en-AU"/>
+        </w:rPr>
+        <w:t>Uv=1</w:t>
       </w:r>
     </w:p>
     <w:p>
@@ -9991,19 +9651,11 @@
           <w:lang w:val="en-AU"/>
         </w:rPr>
       </w:pPr>
-      <w:proofErr w:type="spellStart"/>
-      <w:r>
-        <w:rPr>
-          <w:lang w:val="en-AU"/>
-        </w:rPr>
-        <w:t>Uv</w:t>
-      </w:r>
-      <w:proofErr w:type="spellEnd"/>
-      <w:r>
-        <w:rPr>
-          <w:lang w:val="en-AU"/>
-        </w:rPr>
-        <w:t xml:space="preserve"> keep as zero</w:t>
+      <w:r>
+        <w:rPr>
+          <w:lang w:val="en-AU"/>
+        </w:rPr>
+        <w:t>Uv keep as zero</w:t>
       </w:r>
     </w:p>
     <w:p>
@@ -14016,21 +13668,7 @@
         <w:rPr>
           <w:lang w:val="en-AU"/>
         </w:rPr>
-        <w:t xml:space="preserve">It did </w:t>
-      </w:r>
-      <w:proofErr w:type="gramStart"/>
-      <w:r>
-        <w:rPr>
-          <w:lang w:val="en-AU"/>
-        </w:rPr>
-        <w:t>clipping</w:t>
-      </w:r>
-      <w:proofErr w:type="gramEnd"/>
-      <w:r>
-        <w:rPr>
-          <w:lang w:val="en-AU"/>
-        </w:rPr>
-        <w:t xml:space="preserve"> first then scaled</w:t>
+        <w:t>It did clipping first then scaled</w:t>
       </w:r>
     </w:p>
     <w:p>
@@ -14117,6 +13755,9 @@
         </w:rPr>
       </w:pPr>
       <w:r>
+        <w:rPr>
+          <w:noProof/>
+        </w:rPr>
         <w:drawing>
           <wp:inline distT="0" distB="0" distL="0" distR="0" wp14:anchorId="063F5ADC" wp14:editId="3780824C">
             <wp:extent cx="5501265" cy="3219975"/>
@@ -14180,6 +13821,9 @@
         </w:rPr>
       </w:pPr>
       <w:r>
+        <w:rPr>
+          <w:noProof/>
+        </w:rPr>
         <w:drawing>
           <wp:inline distT="0" distB="0" distL="0" distR="0" wp14:anchorId="4EAD3D90" wp14:editId="4D5AFDA4">
             <wp:extent cx="5501266" cy="3219976"/>
@@ -14301,21 +13945,7 @@
         <w:rPr>
           <w:lang w:val="en-AU"/>
         </w:rPr>
-        <w:t xml:space="preserve">The results itself changed, it is just because the scaling was too small and the clipping </w:t>
-      </w:r>
-      <w:proofErr w:type="spellStart"/>
-      <w:r>
-        <w:rPr>
-          <w:lang w:val="en-AU"/>
-        </w:rPr>
-        <w:t>idd</w:t>
-      </w:r>
-      <w:proofErr w:type="spellEnd"/>
-      <w:r>
-        <w:rPr>
-          <w:lang w:val="en-AU"/>
-        </w:rPr>
-        <w:t xml:space="preserve"> not click in</w:t>
+        <w:t>The results itself changed, it is just because the scaling was too small and the clipping idd not click in</w:t>
       </w:r>
     </w:p>
     <w:p>
@@ -14333,21 +13963,7 @@
         <w:rPr>
           <w:lang w:val="en-AU"/>
         </w:rPr>
-        <w:t xml:space="preserve">Try to ensure the </w:t>
-      </w:r>
-      <w:proofErr w:type="spellStart"/>
-      <w:r>
-        <w:rPr>
-          <w:lang w:val="en-AU"/>
-        </w:rPr>
-        <w:t>sunsolve</w:t>
-      </w:r>
-      <w:proofErr w:type="spellEnd"/>
-      <w:r>
-        <w:rPr>
-          <w:lang w:val="en-AU"/>
-        </w:rPr>
-        <w:t xml:space="preserve"> has the clipping as well</w:t>
+        <w:t>Try to ensure the sunsolve has the clipping as well</w:t>
       </w:r>
     </w:p>
     <w:p>
@@ -14437,21 +14053,7 @@
         <w:rPr>
           <w:lang w:val="en-AU"/>
         </w:rPr>
-        <w:t xml:space="preserve">Check if the results </w:t>
-      </w:r>
-      <w:proofErr w:type="gramStart"/>
-      <w:r>
-        <w:rPr>
-          <w:lang w:val="en-AU"/>
-        </w:rPr>
-        <w:t>is</w:t>
-      </w:r>
-      <w:proofErr w:type="gramEnd"/>
-      <w:r>
-        <w:rPr>
-          <w:lang w:val="en-AU"/>
-        </w:rPr>
-        <w:t xml:space="preserve"> identical</w:t>
+        <w:t>Check if the results is identical</w:t>
       </w:r>
     </w:p>
     <w:p>
@@ -14505,21 +14107,7 @@
         <w:rPr>
           <w:lang w:val="en-AU"/>
         </w:rPr>
-        <w:t xml:space="preserve">The daily plot looks </w:t>
-      </w:r>
-      <w:proofErr w:type="gramStart"/>
-      <w:r>
-        <w:rPr>
-          <w:lang w:val="en-AU"/>
-        </w:rPr>
-        <w:t>strange,</w:t>
-      </w:r>
-      <w:proofErr w:type="gramEnd"/>
-      <w:r>
-        <w:rPr>
-          <w:lang w:val="en-AU"/>
-        </w:rPr>
-        <w:t xml:space="preserve"> it seems to fill the nan with zero</w:t>
+        <w:t>The daily plot looks strange, it seems to fill the nan with zero</w:t>
       </w:r>
     </w:p>
     <w:p>
@@ -14537,21 +14125,7 @@
         <w:rPr>
           <w:lang w:val="en-AU"/>
         </w:rPr>
-        <w:t xml:space="preserve">Goal, make the </w:t>
-      </w:r>
-      <w:proofErr w:type="gramStart"/>
-      <w:r>
-        <w:rPr>
-          <w:lang w:val="en-AU"/>
-        </w:rPr>
-        <w:t>MBE(</w:t>
-      </w:r>
-      <w:proofErr w:type="gramEnd"/>
-      <w:r>
-        <w:rPr>
-          <w:lang w:val="en-AU"/>
-        </w:rPr>
-        <w:t>scale-&gt;clip-&gt;resample) to 0 for</w:t>
+        <w:t>Goal, make the MBE(scale-&gt;clip-&gt;resample) to 0 for</w:t>
       </w:r>
     </w:p>
     <w:p>
@@ -14637,21 +14211,7 @@
         <w:rPr>
           <w:lang w:val="en-AU"/>
         </w:rPr>
-        <w:t xml:space="preserve">Goal, make the </w:t>
-      </w:r>
-      <w:proofErr w:type="gramStart"/>
-      <w:r>
-        <w:rPr>
-          <w:lang w:val="en-AU"/>
-        </w:rPr>
-        <w:t>MBE(</w:t>
-      </w:r>
-      <w:proofErr w:type="gramEnd"/>
-      <w:r>
-        <w:rPr>
-          <w:lang w:val="en-AU"/>
-        </w:rPr>
-        <w:t>scale-&gt;clip-&gt;resample) to 0 for</w:t>
+        <w:t>Goal, make the MBE(scale-&gt;clip-&gt;resample) to 0 for</w:t>
       </w:r>
     </w:p>
     <w:p>
@@ -15239,10 +14799,1106 @@
     </w:p>
     <w:p>
       <w:pPr>
-        <w:rPr>
-          <w:lang w:val="en-AU"/>
-        </w:rPr>
-      </w:pPr>
+        <w:pStyle w:val="Heading1"/>
+        <w:rPr>
+          <w:lang w:val="en-AU"/>
+        </w:rPr>
+      </w:pPr>
+      <w:r>
+        <w:rPr>
+          <w:lang w:val="en-AU"/>
+        </w:rPr>
+        <w:t>25-10-22</w:t>
+      </w:r>
+    </w:p>
+    <w:p>
+      <w:pPr>
+        <w:pStyle w:val="ListParagraph"/>
+        <w:numPr>
+          <w:ilvl w:val="0"/>
+          <w:numId w:val="12"/>
+        </w:numPr>
+        <w:rPr>
+          <w:lang w:val="en-AU"/>
+        </w:rPr>
+      </w:pPr>
+      <w:r>
+        <w:rPr>
+          <w:lang w:val="en-AU"/>
+        </w:rPr>
+        <w:t>Another problem I realised is that SunSolve Yield is single albedo but the Pvsyst is monthly albedo</w:t>
+      </w:r>
+    </w:p>
+    <w:p>
+      <w:pPr>
+        <w:pStyle w:val="ListParagraph"/>
+        <w:numPr>
+          <w:ilvl w:val="0"/>
+          <w:numId w:val="12"/>
+        </w:numPr>
+        <w:rPr>
+          <w:lang w:val="en-AU"/>
+        </w:rPr>
+      </w:pPr>
+      <w:r>
+        <w:rPr>
+          <w:lang w:val="en-AU"/>
+        </w:rPr>
+        <w:t>Today, build one with monthly albedo using existing file to mimic PVsyst</w:t>
+      </w:r>
+    </w:p>
+    <w:p>
+      <w:pPr>
+        <w:pStyle w:val="ListParagraph"/>
+        <w:numPr>
+          <w:ilvl w:val="0"/>
+          <w:numId w:val="12"/>
+        </w:numPr>
+        <w:rPr>
+          <w:lang w:val="en-AU"/>
+        </w:rPr>
+      </w:pPr>
+      <w:r>
+        <w:rPr>
+          <w:lang w:val="en-AU"/>
+        </w:rPr>
+        <w:t>Each file</w:t>
+      </w:r>
+    </w:p>
+    <w:p>
+      <w:pPr>
+        <w:pStyle w:val="ListParagraph"/>
+        <w:numPr>
+          <w:ilvl w:val="1"/>
+          <w:numId w:val="12"/>
+        </w:numPr>
+        <w:rPr>
+          <w:lang w:val="en-AU"/>
+        </w:rPr>
+      </w:pPr>
+      <w:r>
+        <w:rPr>
+          <w:lang w:val="en-AU"/>
+        </w:rPr>
+        <w:t>Update date</w:t>
+      </w:r>
+    </w:p>
+    <w:p>
+      <w:pPr>
+        <w:pStyle w:val="ListParagraph"/>
+        <w:numPr>
+          <w:ilvl w:val="1"/>
+          <w:numId w:val="12"/>
+        </w:numPr>
+        <w:rPr>
+          <w:lang w:val="en-AU"/>
+        </w:rPr>
+      </w:pPr>
+      <w:r>
+        <w:rPr>
+          <w:lang w:val="en-AU"/>
+        </w:rPr>
+        <w:t xml:space="preserve">Update albedo value as </w:t>
+      </w:r>
+      <w:r>
+        <w:rPr>
+          <w:lang w:val="en-AU"/>
+        </w:rPr>
+        <w:t xml:space="preserve">a </w:t>
+      </w:r>
+      <w:r>
+        <w:rPr>
+          <w:lang w:val="en-AU"/>
+        </w:rPr>
+        <w:t>constant</w:t>
+      </w:r>
+    </w:p>
+    <w:p>
+      <w:pPr>
+        <w:pStyle w:val="ListParagraph"/>
+        <w:numPr>
+          <w:ilvl w:val="0"/>
+          <w:numId w:val="12"/>
+        </w:numPr>
+        <w:rPr>
+          <w:lang w:val="en-AU"/>
+        </w:rPr>
+      </w:pPr>
+      <w:r>
+        <w:rPr>
+          <w:lang w:val="en-AU"/>
+        </w:rPr>
+        <w:t>Now, update to exclude mounting systems</w:t>
+      </w:r>
+    </w:p>
+    <w:p>
+      <w:pPr>
+        <w:pStyle w:val="ListParagraph"/>
+        <w:numPr>
+          <w:ilvl w:val="1"/>
+          <w:numId w:val="12"/>
+        </w:numPr>
+        <w:rPr>
+          <w:lang w:val="en-AU"/>
+        </w:rPr>
+      </w:pPr>
+      <w:r>
+        <w:rPr>
+          <w:lang w:val="en-AU"/>
+        </w:rPr>
+        <w:t>Open each sim file of the old folder on Sunsolve</w:t>
+      </w:r>
+    </w:p>
+    <w:p>
+      <w:pPr>
+        <w:pStyle w:val="ListParagraph"/>
+        <w:numPr>
+          <w:ilvl w:val="2"/>
+          <w:numId w:val="12"/>
+        </w:numPr>
+        <w:rPr>
+          <w:lang w:val="en-AU"/>
+        </w:rPr>
+      </w:pPr>
+      <w:r>
+        <w:rPr>
+          <w:lang w:val="en-AU"/>
+        </w:rPr>
+        <w:t>Turn off transparent mounting</w:t>
+      </w:r>
+    </w:p>
+    <w:p>
+      <w:pPr>
+        <w:pStyle w:val="ListParagraph"/>
+        <w:numPr>
+          <w:ilvl w:val="2"/>
+          <w:numId w:val="12"/>
+        </w:numPr>
+        <w:rPr>
+          <w:lang w:val="en-AU"/>
+        </w:rPr>
+      </w:pPr>
+      <w:r>
+        <w:rPr>
+          <w:lang w:val="en-AU"/>
+        </w:rPr>
+        <w:t>Rerun the simulation</w:t>
+      </w:r>
+    </w:p>
+    <w:p>
+      <w:pPr>
+        <w:pStyle w:val="ListParagraph"/>
+        <w:numPr>
+          <w:ilvl w:val="2"/>
+          <w:numId w:val="12"/>
+        </w:numPr>
+        <w:rPr>
+          <w:lang w:val="en-AU"/>
+        </w:rPr>
+      </w:pPr>
+      <w:r>
+        <w:rPr>
+          <w:lang w:val="en-AU"/>
+        </w:rPr>
+        <w:t>Save the simulation file</w:t>
+      </w:r>
+    </w:p>
+    <w:p>
+      <w:pPr>
+        <w:pStyle w:val="ListParagraph"/>
+        <w:numPr>
+          <w:ilvl w:val="2"/>
+          <w:numId w:val="12"/>
+        </w:numPr>
+        <w:rPr>
+          <w:lang w:val="en-AU"/>
+        </w:rPr>
+      </w:pPr>
+      <w:r>
+        <w:rPr>
+          <w:lang w:val="en-AU"/>
+        </w:rPr>
+        <w:t>Save the csv file</w:t>
+      </w:r>
+    </w:p>
+    <w:p>
+      <w:pPr>
+        <w:pStyle w:val="ListParagraph"/>
+        <w:numPr>
+          <w:ilvl w:val="0"/>
+          <w:numId w:val="12"/>
+        </w:numPr>
+        <w:rPr>
+          <w:lang w:val="en-AU"/>
+        </w:rPr>
+      </w:pPr>
+      <w:r>
+        <w:rPr>
+          <w:lang w:val="en-AU"/>
+        </w:rPr>
+        <w:t>I need to change too much to the mounting system</w:t>
+      </w:r>
+    </w:p>
+    <w:p>
+      <w:pPr>
+        <w:pStyle w:val="ListParagraph"/>
+        <w:numPr>
+          <w:ilvl w:val="0"/>
+          <w:numId w:val="12"/>
+        </w:numPr>
+        <w:rPr>
+          <w:lang w:val="en-AU"/>
+        </w:rPr>
+      </w:pPr>
+      <w:r>
+        <w:rPr>
+          <w:lang w:val="en-AU"/>
+        </w:rPr>
+        <w:t>For each file</w:t>
+      </w:r>
+    </w:p>
+    <w:p>
+      <w:pPr>
+        <w:pStyle w:val="ListParagraph"/>
+        <w:numPr>
+          <w:ilvl w:val="1"/>
+          <w:numId w:val="12"/>
+        </w:numPr>
+        <w:rPr>
+          <w:lang w:val="en-AU"/>
+        </w:rPr>
+      </w:pPr>
+      <w:r>
+        <w:rPr>
+          <w:lang w:val="en-AU"/>
+        </w:rPr>
+        <w:t>Change the month</w:t>
+      </w:r>
+    </w:p>
+    <w:p>
+      <w:pPr>
+        <w:pStyle w:val="ListParagraph"/>
+        <w:numPr>
+          <w:ilvl w:val="1"/>
+          <w:numId w:val="12"/>
+        </w:numPr>
+        <w:rPr>
+          <w:lang w:val="en-AU"/>
+        </w:rPr>
+      </w:pPr>
+      <w:r>
+        <w:rPr>
+          <w:lang w:val="en-AU"/>
+        </w:rPr>
+        <w:t>Change the albedo</w:t>
+      </w:r>
+    </w:p>
+    <w:p>
+      <w:pPr>
+        <w:pStyle w:val="ListParagraph"/>
+        <w:numPr>
+          <w:ilvl w:val="1"/>
+          <w:numId w:val="12"/>
+        </w:numPr>
+        <w:rPr>
+          <w:lang w:val="en-AU"/>
+        </w:rPr>
+      </w:pPr>
+      <w:r>
+        <w:rPr>
+          <w:lang w:val="en-AU"/>
+        </w:rPr>
+        <w:t>Rerun the simulation</w:t>
+      </w:r>
+    </w:p>
+    <w:p>
+      <w:pPr>
+        <w:pStyle w:val="ListParagraph"/>
+        <w:numPr>
+          <w:ilvl w:val="1"/>
+          <w:numId w:val="12"/>
+        </w:numPr>
+        <w:rPr>
+          <w:lang w:val="en-AU"/>
+        </w:rPr>
+      </w:pPr>
+      <w:r>
+        <w:rPr>
+          <w:lang w:val="en-AU"/>
+        </w:rPr>
+        <w:t>Save the simulation file</w:t>
+      </w:r>
+    </w:p>
+    <w:p>
+      <w:pPr>
+        <w:pStyle w:val="ListParagraph"/>
+        <w:numPr>
+          <w:ilvl w:val="1"/>
+          <w:numId w:val="12"/>
+        </w:numPr>
+        <w:rPr>
+          <w:lang w:val="en-AU"/>
+        </w:rPr>
+      </w:pPr>
+      <w:r>
+        <w:rPr>
+          <w:lang w:val="en-AU"/>
+        </w:rPr>
+        <w:t>Save the csv file</w:t>
+      </w:r>
+    </w:p>
+    <w:p>
+      <w:pPr>
+        <w:pStyle w:val="ListParagraph"/>
+        <w:numPr>
+          <w:ilvl w:val="0"/>
+          <w:numId w:val="12"/>
+        </w:numPr>
+        <w:rPr>
+          <w:lang w:val="en-AU"/>
+        </w:rPr>
+      </w:pPr>
+      <w:r>
+        <w:rPr>
+          <w:lang w:val="en-AU"/>
+        </w:rPr>
+        <w:t>Next step is to enable the incident light spectrum</w:t>
+      </w:r>
+    </w:p>
+    <w:p>
+      <w:pPr>
+        <w:pStyle w:val="ListParagraph"/>
+        <w:numPr>
+          <w:ilvl w:val="0"/>
+          <w:numId w:val="12"/>
+        </w:numPr>
+        <w:rPr>
+          <w:lang w:val="en-AU"/>
+        </w:rPr>
+      </w:pPr>
+      <w:r>
+        <w:rPr>
+          <w:lang w:val="en-AU"/>
+        </w:rPr>
+        <w:t>For each file from mounting</w:t>
+      </w:r>
+      <w:r>
+        <w:rPr>
+          <w:lang w:val="en-AU"/>
+        </w:rPr>
+        <w:t xml:space="preserve"> month</w:t>
+      </w:r>
+    </w:p>
+    <w:p>
+      <w:pPr>
+        <w:pStyle w:val="ListParagraph"/>
+        <w:numPr>
+          <w:ilvl w:val="1"/>
+          <w:numId w:val="12"/>
+        </w:numPr>
+        <w:rPr>
+          <w:lang w:val="en-AU"/>
+        </w:rPr>
+      </w:pPr>
+      <w:r>
+        <w:rPr>
+          <w:lang w:val="en-AU"/>
+        </w:rPr>
+        <w:t>Enable the spectrum</w:t>
+      </w:r>
+      <w:r>
+        <w:rPr>
+          <w:lang w:val="en-AU"/>
+        </w:rPr>
+        <w:t xml:space="preserve"> from always AM1.5G to calculate</w:t>
+      </w:r>
+    </w:p>
+    <w:p>
+      <w:pPr>
+        <w:pStyle w:val="ListParagraph"/>
+        <w:numPr>
+          <w:ilvl w:val="1"/>
+          <w:numId w:val="12"/>
+        </w:numPr>
+        <w:rPr>
+          <w:lang w:val="en-AU"/>
+        </w:rPr>
+      </w:pPr>
+      <w:r>
+        <w:rPr>
+          <w:lang w:val="en-AU"/>
+        </w:rPr>
+        <w:t>E</w:t>
+      </w:r>
+      <w:r>
+        <w:rPr>
+          <w:rFonts w:hint="eastAsia"/>
+          <w:lang w:val="en-AU"/>
+        </w:rPr>
+        <w:t>nable</w:t>
+      </w:r>
+      <w:r>
+        <w:rPr>
+          <w:lang w:val="en-AU"/>
+        </w:rPr>
+        <w:t xml:space="preserve"> EQE in the modules</w:t>
+      </w:r>
+    </w:p>
+    <w:p>
+      <w:pPr>
+        <w:pStyle w:val="ListParagraph"/>
+        <w:numPr>
+          <w:ilvl w:val="1"/>
+          <w:numId w:val="12"/>
+        </w:numPr>
+        <w:rPr>
+          <w:lang w:val="en-AU"/>
+        </w:rPr>
+      </w:pPr>
+      <w:r>
+        <w:rPr>
+          <w:lang w:val="en-AU"/>
+        </w:rPr>
+        <w:lastRenderedPageBreak/>
+        <w:t>Update albedo to soil</w:t>
+      </w:r>
+    </w:p>
+    <w:p>
+      <w:pPr>
+        <w:pStyle w:val="ListParagraph"/>
+        <w:numPr>
+          <w:ilvl w:val="2"/>
+          <w:numId w:val="12"/>
+        </w:numPr>
+        <w:rPr>
+          <w:lang w:val="en-AU"/>
+        </w:rPr>
+      </w:pPr>
+      <w:r>
+        <w:rPr>
+          <w:lang w:val="en-AU"/>
+        </w:rPr>
+        <w:t>Run the simulation</w:t>
+      </w:r>
+      <w:r>
+        <w:rPr>
+          <w:lang w:val="en-AU"/>
+        </w:rPr>
+        <w:tab/>
+      </w:r>
+    </w:p>
+    <w:p>
+      <w:pPr>
+        <w:pStyle w:val="ListParagraph"/>
+        <w:numPr>
+          <w:ilvl w:val="2"/>
+          <w:numId w:val="12"/>
+        </w:numPr>
+        <w:rPr>
+          <w:lang w:val="en-AU"/>
+        </w:rPr>
+      </w:pPr>
+      <w:r>
+        <w:rPr>
+          <w:lang w:val="en-AU"/>
+        </w:rPr>
+        <w:t>Save the simulation file</w:t>
+      </w:r>
+    </w:p>
+    <w:p>
+      <w:pPr>
+        <w:pStyle w:val="ListParagraph"/>
+        <w:numPr>
+          <w:ilvl w:val="2"/>
+          <w:numId w:val="12"/>
+        </w:numPr>
+        <w:rPr>
+          <w:lang w:val="en-AU"/>
+        </w:rPr>
+      </w:pPr>
+      <w:r>
+        <w:rPr>
+          <w:lang w:val="en-AU"/>
+        </w:rPr>
+        <w:t>Save the csv file</w:t>
+      </w:r>
+    </w:p>
+    <w:p>
+      <w:pPr>
+        <w:pStyle w:val="ListParagraph"/>
+        <w:numPr>
+          <w:ilvl w:val="1"/>
+          <w:numId w:val="12"/>
+        </w:numPr>
+        <w:rPr>
+          <w:lang w:val="en-AU"/>
+        </w:rPr>
+      </w:pPr>
+      <w:r>
+        <w:rPr>
+          <w:lang w:val="en-AU"/>
+        </w:rPr>
+        <w:t>Update albedo to vegetation</w:t>
+      </w:r>
+    </w:p>
+    <w:p>
+      <w:pPr>
+        <w:pStyle w:val="ListParagraph"/>
+        <w:numPr>
+          <w:ilvl w:val="2"/>
+          <w:numId w:val="12"/>
+        </w:numPr>
+        <w:rPr>
+          <w:lang w:val="en-AU"/>
+        </w:rPr>
+      </w:pPr>
+      <w:r>
+        <w:rPr>
+          <w:lang w:val="en-AU"/>
+        </w:rPr>
+        <w:t>Run</w:t>
+      </w:r>
+    </w:p>
+    <w:p>
+      <w:pPr>
+        <w:pStyle w:val="ListParagraph"/>
+        <w:numPr>
+          <w:ilvl w:val="2"/>
+          <w:numId w:val="12"/>
+        </w:numPr>
+        <w:rPr>
+          <w:lang w:val="en-AU"/>
+        </w:rPr>
+      </w:pPr>
+      <w:r>
+        <w:rPr>
+          <w:lang w:val="en-AU"/>
+        </w:rPr>
+        <w:t>Save sim</w:t>
+      </w:r>
+    </w:p>
+    <w:p>
+      <w:pPr>
+        <w:pStyle w:val="ListParagraph"/>
+        <w:numPr>
+          <w:ilvl w:val="2"/>
+          <w:numId w:val="12"/>
+        </w:numPr>
+        <w:rPr>
+          <w:lang w:val="en-AU"/>
+        </w:rPr>
+      </w:pPr>
+      <w:r>
+        <w:rPr>
+          <w:lang w:val="en-AU"/>
+        </w:rPr>
+        <w:t>Save csv</w:t>
+      </w:r>
+    </w:p>
+    <w:p>
+      <w:pPr>
+        <w:pStyle w:val="Heading1"/>
+        <w:rPr>
+          <w:lang w:val="en-AU"/>
+        </w:rPr>
+      </w:pPr>
+      <w:r>
+        <w:rPr>
+          <w:lang w:val="en-AU"/>
+        </w:rPr>
+        <w:t>25-10-23</w:t>
+      </w:r>
+    </w:p>
+    <w:p>
+      <w:pPr>
+        <w:pStyle w:val="ListParagraph"/>
+        <w:numPr>
+          <w:ilvl w:val="0"/>
+          <w:numId w:val="13"/>
+        </w:numPr>
+        <w:rPr>
+          <w:lang w:val="en-AU"/>
+        </w:rPr>
+      </w:pPr>
+      <w:r>
+        <w:rPr>
+          <w:lang w:val="en-AU"/>
+        </w:rPr>
+        <w:t>Finished mounting</w:t>
+      </w:r>
+    </w:p>
+    <w:p>
+      <w:pPr>
+        <w:pStyle w:val="ListParagraph"/>
+        <w:numPr>
+          <w:ilvl w:val="0"/>
+          <w:numId w:val="13"/>
+        </w:numPr>
+        <w:rPr>
+          <w:lang w:val="en-AU"/>
+        </w:rPr>
+      </w:pPr>
+      <w:r>
+        <w:rPr>
+          <w:lang w:val="en-AU"/>
+        </w:rPr>
+        <w:t>Next step is the gaps between modules</w:t>
+      </w:r>
+    </w:p>
+    <w:p>
+      <w:pPr>
+        <w:pStyle w:val="ListParagraph"/>
+        <w:numPr>
+          <w:ilvl w:val="0"/>
+          <w:numId w:val="13"/>
+        </w:numPr>
+        <w:rPr>
+          <w:lang w:val="en-AU"/>
+        </w:rPr>
+      </w:pPr>
+      <w:r>
+        <w:rPr>
+          <w:lang w:val="en-AU"/>
+        </w:rPr>
+        <w:t>For each monthly file in mounting folder</w:t>
+      </w:r>
+    </w:p>
+    <w:p>
+      <w:pPr>
+        <w:pStyle w:val="ListParagraph"/>
+        <w:numPr>
+          <w:ilvl w:val="1"/>
+          <w:numId w:val="13"/>
+        </w:numPr>
+        <w:rPr>
+          <w:lang w:val="en-AU"/>
+        </w:rPr>
+      </w:pPr>
+      <w:r>
+        <w:rPr>
+          <w:lang w:val="en-AU"/>
+        </w:rPr>
+        <w:t>Remove the gap blocks</w:t>
+      </w:r>
+    </w:p>
+    <w:p>
+      <w:pPr>
+        <w:pStyle w:val="ListParagraph"/>
+        <w:numPr>
+          <w:ilvl w:val="1"/>
+          <w:numId w:val="13"/>
+        </w:numPr>
+        <w:rPr>
+          <w:lang w:val="en-AU"/>
+        </w:rPr>
+      </w:pPr>
+      <w:r>
+        <w:rPr>
+          <w:lang w:val="en-AU"/>
+        </w:rPr>
+        <w:t>Run</w:t>
+      </w:r>
+    </w:p>
+    <w:p>
+      <w:pPr>
+        <w:pStyle w:val="ListParagraph"/>
+        <w:numPr>
+          <w:ilvl w:val="2"/>
+          <w:numId w:val="13"/>
+        </w:numPr>
+        <w:rPr>
+          <w:lang w:val="en-AU"/>
+        </w:rPr>
+      </w:pPr>
+      <w:r>
+        <w:rPr>
+          <w:lang w:val="en-AU"/>
+        </w:rPr>
+        <w:t>Save sim</w:t>
+      </w:r>
+    </w:p>
+    <w:p>
+      <w:pPr>
+        <w:pStyle w:val="ListParagraph"/>
+        <w:numPr>
+          <w:ilvl w:val="2"/>
+          <w:numId w:val="13"/>
+        </w:numPr>
+        <w:rPr>
+          <w:lang w:val="en-AU"/>
+        </w:rPr>
+      </w:pPr>
+      <w:r>
+        <w:rPr>
+          <w:lang w:val="en-AU"/>
+        </w:rPr>
+        <w:t>Save csv</w:t>
+      </w:r>
+    </w:p>
+    <w:p>
+      <w:pPr>
+        <w:pStyle w:val="ListParagraph"/>
+        <w:numPr>
+          <w:ilvl w:val="0"/>
+          <w:numId w:val="13"/>
+        </w:numPr>
+        <w:rPr>
+          <w:lang w:val="en-AU"/>
+        </w:rPr>
+      </w:pPr>
+      <w:r>
+        <w:rPr>
+          <w:lang w:val="en-AU"/>
+        </w:rPr>
+        <w:t>The problem with the module frame is that the module frame does not seems to work</w:t>
+      </w:r>
+    </w:p>
+    <w:p>
+      <w:pPr>
+        <w:pStyle w:val="ListParagraph"/>
+        <w:numPr>
+          <w:ilvl w:val="1"/>
+          <w:numId w:val="13"/>
+        </w:numPr>
+        <w:rPr>
+          <w:lang w:val="en-AU"/>
+        </w:rPr>
+      </w:pPr>
+      <w:r>
+        <w:rPr>
+          <w:lang w:val="en-AU"/>
+        </w:rPr>
+        <w:t>My estimation was that the vertical gap is smaller than the module frame dimension, the module does not understand the dimension includes the module frame</w:t>
+      </w:r>
+    </w:p>
+    <w:p>
+      <w:pPr>
+        <w:pStyle w:val="ListParagraph"/>
+        <w:numPr>
+          <w:ilvl w:val="1"/>
+          <w:numId w:val="13"/>
+        </w:numPr>
+        <w:rPr>
+          <w:lang w:val="en-AU"/>
+        </w:rPr>
+      </w:pPr>
+      <w:r>
+        <w:rPr>
+          <w:lang w:val="en-AU"/>
+        </w:rPr>
+        <w:t>The plan is to try to fix that regarding the module frame</w:t>
+      </w:r>
+    </w:p>
+    <w:p>
+      <w:pPr>
+        <w:pStyle w:val="ListParagraph"/>
+        <w:numPr>
+          <w:ilvl w:val="2"/>
+          <w:numId w:val="13"/>
+        </w:numPr>
+        <w:rPr>
+          <w:lang w:val="en-AU"/>
+        </w:rPr>
+      </w:pPr>
+      <w:r>
+        <w:rPr>
+          <w:lang w:val="en-AU"/>
+        </w:rPr>
+        <w:t>Add the module frame in the module file</w:t>
+      </w:r>
+    </w:p>
+    <w:p>
+      <w:pPr>
+        <w:pStyle w:val="ListParagraph"/>
+        <w:numPr>
+          <w:ilvl w:val="2"/>
+          <w:numId w:val="13"/>
+        </w:numPr>
+        <w:rPr>
+          <w:lang w:val="en-AU"/>
+        </w:rPr>
+      </w:pPr>
+      <w:r>
+        <w:rPr>
+          <w:lang w:val="en-AU"/>
+        </w:rPr>
+        <w:t>Enable the module frame in options</w:t>
+      </w:r>
+    </w:p>
+    <w:p>
+      <w:pPr>
+        <w:pStyle w:val="ListParagraph"/>
+        <w:numPr>
+          <w:ilvl w:val="2"/>
+          <w:numId w:val="13"/>
+        </w:numPr>
+        <w:rPr>
+          <w:lang w:val="en-AU"/>
+        </w:rPr>
+      </w:pPr>
+      <w:r>
+        <w:rPr>
+          <w:lang w:val="en-AU"/>
+        </w:rPr>
+        <w:t>Update the module thickness</w:t>
+      </w:r>
+    </w:p>
+    <w:p>
+      <w:pPr>
+        <w:pStyle w:val="ListParagraph"/>
+        <w:numPr>
+          <w:ilvl w:val="2"/>
+          <w:numId w:val="13"/>
+        </w:numPr>
+        <w:rPr>
+          <w:lang w:val="en-AU"/>
+        </w:rPr>
+      </w:pPr>
+      <w:r>
+        <w:rPr>
+          <w:lang w:val="en-AU"/>
+        </w:rPr>
+        <w:t>Try to see if it works</w:t>
+      </w:r>
+    </w:p>
+    <w:p>
+      <w:pPr>
+        <w:pStyle w:val="ListParagraph"/>
+        <w:numPr>
+          <w:ilvl w:val="2"/>
+          <w:numId w:val="13"/>
+        </w:numPr>
+        <w:rPr>
+          <w:lang w:val="en-AU"/>
+        </w:rPr>
+      </w:pPr>
+      <w:r>
+        <w:rPr>
+          <w:lang w:val="en-AU"/>
+        </w:rPr>
+        <w:t>Worked</w:t>
+      </w:r>
+    </w:p>
+    <w:p>
+      <w:pPr>
+        <w:pStyle w:val="ListParagraph"/>
+        <w:numPr>
+          <w:ilvl w:val="1"/>
+          <w:numId w:val="13"/>
+        </w:numPr>
+        <w:rPr>
+          <w:lang w:val="en-AU"/>
+        </w:rPr>
+      </w:pPr>
+      <w:r>
+        <w:rPr>
+          <w:lang w:val="en-AU"/>
+        </w:rPr>
+        <w:t>Double check, save the sim file that worked. Email to ask Keith if I need to increase the gaps to account for the farme or not?</w:t>
+      </w:r>
+    </w:p>
+    <w:p>
+      <w:pPr>
+        <w:pStyle w:val="ListParagraph"/>
+        <w:numPr>
+          <w:ilvl w:val="1"/>
+          <w:numId w:val="13"/>
+        </w:numPr>
+        <w:rPr>
+          <w:lang w:val="en-AU"/>
+        </w:rPr>
+      </w:pPr>
+      <w:r>
+        <w:rPr>
+          <w:lang w:val="en-AU"/>
+        </w:rPr>
+        <w:t>Do an experiment to make frame very big to see where it expands to</w:t>
+      </w:r>
+    </w:p>
+    <w:p>
+      <w:pPr>
+        <w:pStyle w:val="ListParagraph"/>
+        <w:numPr>
+          <w:ilvl w:val="1"/>
+          <w:numId w:val="13"/>
+        </w:numPr>
+        <w:rPr>
+          <w:lang w:val="en-AU"/>
+        </w:rPr>
+      </w:pPr>
+      <w:r>
+        <w:rPr>
+          <w:lang w:val="en-AU"/>
+        </w:rPr>
+        <w:lastRenderedPageBreak/>
+        <w:t>The experiment shows that it expands inward</w:t>
+      </w:r>
+      <w:r>
+        <w:rPr>
+          <w:lang w:val="en-AU"/>
+        </w:rPr>
+        <w:drawing>
+          <wp:inline distT="0" distB="0" distL="0" distR="0" wp14:anchorId="6CDC81B7" wp14:editId="6537EB72">
+            <wp:extent cx="3581900" cy="1876687"/>
+            <wp:effectExtent l="0" t="0" r="0" b="9525"/>
+            <wp:docPr id="479192014" name="Picture 1" descr="A close-up of a blue and white panel&#10;&#10;AI-generated content may be incorrect."/>
+            <wp:cNvGraphicFramePr>
+              <a:graphicFrameLocks xmlns:a="http://schemas.openxmlformats.org/drawingml/2006/main" noChangeAspect="1"/>
+            </wp:cNvGraphicFramePr>
+            <a:graphic xmlns:a="http://schemas.openxmlformats.org/drawingml/2006/main">
+              <a:graphicData uri="http://schemas.openxmlformats.org/drawingml/2006/picture">
+                <pic:pic xmlns:pic="http://schemas.openxmlformats.org/drawingml/2006/picture">
+                  <pic:nvPicPr>
+                    <pic:cNvPr id="479192014" name="Picture 1" descr="A close-up of a blue and white panel&#10;&#10;AI-generated content may be incorrect."/>
+                    <pic:cNvPicPr/>
+                  </pic:nvPicPr>
+                  <pic:blipFill>
+                    <a:blip r:embed="rId83"/>
+                    <a:stretch>
+                      <a:fillRect/>
+                    </a:stretch>
+                  </pic:blipFill>
+                  <pic:spPr>
+                    <a:xfrm>
+                      <a:off x="0" y="0"/>
+                      <a:ext cx="3581900" cy="1876687"/>
+                    </a:xfrm>
+                    <a:prstGeom prst="rect">
+                      <a:avLst/>
+                    </a:prstGeom>
+                  </pic:spPr>
+                </pic:pic>
+              </a:graphicData>
+            </a:graphic>
+          </wp:inline>
+        </w:drawing>
+      </w:r>
+    </w:p>
+    <w:p>
+      <w:pPr>
+        <w:pStyle w:val="ListParagraph"/>
+        <w:numPr>
+          <w:ilvl w:val="0"/>
+          <w:numId w:val="13"/>
+        </w:numPr>
+        <w:rPr>
+          <w:lang w:val="en-AU"/>
+        </w:rPr>
+      </w:pPr>
+      <w:r>
+        <w:rPr>
+          <w:lang w:val="en-AU"/>
+        </w:rPr>
+        <w:t>Let us try to update a procedure to simulate for the module frame</w:t>
+      </w:r>
+    </w:p>
+    <w:p>
+      <w:pPr>
+        <w:pStyle w:val="ListParagraph"/>
+        <w:numPr>
+          <w:ilvl w:val="0"/>
+          <w:numId w:val="13"/>
+        </w:numPr>
+        <w:rPr>
+          <w:lang w:val="en-AU"/>
+        </w:rPr>
+      </w:pPr>
+      <w:r>
+        <w:rPr>
+          <w:lang w:val="en-AU"/>
+        </w:rPr>
+        <w:t>For each monthly files in the gap folder</w:t>
+      </w:r>
+    </w:p>
+    <w:p>
+      <w:pPr>
+        <w:pStyle w:val="ListParagraph"/>
+        <w:numPr>
+          <w:ilvl w:val="1"/>
+          <w:numId w:val="13"/>
+        </w:numPr>
+        <w:rPr>
+          <w:lang w:val="en-AU"/>
+        </w:rPr>
+      </w:pPr>
+      <w:r>
+        <w:rPr>
+          <w:lang w:val="en-AU"/>
+        </w:rPr>
+        <w:t>Change the module to the ones with frame</w:t>
+      </w:r>
+    </w:p>
+    <w:p>
+      <w:pPr>
+        <w:pStyle w:val="ListParagraph"/>
+        <w:numPr>
+          <w:ilvl w:val="1"/>
+          <w:numId w:val="13"/>
+        </w:numPr>
+        <w:rPr>
+          <w:lang w:val="en-AU"/>
+        </w:rPr>
+      </w:pPr>
+      <w:r>
+        <w:rPr>
+          <w:lang w:val="en-AU"/>
+        </w:rPr>
+        <w:t>Enable the frame in the options</w:t>
+      </w:r>
+    </w:p>
+    <w:p>
+      <w:pPr>
+        <w:pStyle w:val="ListParagraph"/>
+        <w:numPr>
+          <w:ilvl w:val="1"/>
+          <w:numId w:val="13"/>
+        </w:numPr>
+        <w:rPr>
+          <w:lang w:val="en-AU"/>
+        </w:rPr>
+      </w:pPr>
+      <w:r>
+        <w:rPr>
+          <w:lang w:val="en-AU"/>
+        </w:rPr>
+        <w:t>Run the simulation</w:t>
+      </w:r>
+    </w:p>
+    <w:p>
+      <w:pPr>
+        <w:pStyle w:val="ListParagraph"/>
+        <w:numPr>
+          <w:ilvl w:val="1"/>
+          <w:numId w:val="13"/>
+        </w:numPr>
+        <w:rPr>
+          <w:lang w:val="en-AU"/>
+        </w:rPr>
+      </w:pPr>
+      <w:r>
+        <w:rPr>
+          <w:lang w:val="en-AU"/>
+        </w:rPr>
+        <w:t>Save the sim file</w:t>
+      </w:r>
+    </w:p>
+    <w:p>
+      <w:pPr>
+        <w:pStyle w:val="ListParagraph"/>
+        <w:numPr>
+          <w:ilvl w:val="1"/>
+          <w:numId w:val="13"/>
+        </w:numPr>
+        <w:rPr>
+          <w:lang w:val="en-AU"/>
+        </w:rPr>
+      </w:pPr>
+      <w:r>
+        <w:rPr>
+          <w:lang w:val="en-AU"/>
+        </w:rPr>
+        <w:t>Save the csv file</w:t>
+      </w:r>
     </w:p>
     <w:sectPr>
       <w:pgSz w:w="11906" w:h="16838"/>
@@ -15596,9 +16252,9 @@
     </w:lvl>
   </w:abstractNum>
   <w:abstractNum w:abstractNumId="3" w15:restartNumberingAfterBreak="0">
-    <w:nsid w:val="339D47C4"/>
+    <w:nsid w:val="28F15834"/>
     <w:multiLevelType w:val="hybridMultilevel"/>
-    <w:tmpl w:val="0058B262"/>
+    <w:tmpl w:val="2F2C30A8"/>
     <w:lvl w:ilvl="0" w:tplc="0C090001">
       <w:start w:val="1"/>
       <w:numFmt w:val="bullet"/>
@@ -15709,6 +16365,119 @@
     </w:lvl>
   </w:abstractNum>
   <w:abstractNum w:abstractNumId="4" w15:restartNumberingAfterBreak="0">
+    <w:nsid w:val="339D47C4"/>
+    <w:multiLevelType w:val="hybridMultilevel"/>
+    <w:tmpl w:val="0058B262"/>
+    <w:lvl w:ilvl="0" w:tplc="0C090001">
+      <w:start w:val="1"/>
+      <w:numFmt w:val="bullet"/>
+      <w:lvlText w:val=""/>
+      <w:lvlJc w:val="left"/>
+      <w:pPr>
+        <w:ind w:left="720" w:hanging="360"/>
+      </w:pPr>
+      <w:rPr>
+        <w:rFonts w:ascii="Symbol" w:hAnsi="Symbol" w:hint="default"/>
+      </w:rPr>
+    </w:lvl>
+    <w:lvl w:ilvl="1" w:tplc="0C090003">
+      <w:start w:val="1"/>
+      <w:numFmt w:val="bullet"/>
+      <w:lvlText w:val="o"/>
+      <w:lvlJc w:val="left"/>
+      <w:pPr>
+        <w:ind w:left="1440" w:hanging="360"/>
+      </w:pPr>
+      <w:rPr>
+        <w:rFonts w:ascii="Courier New" w:hAnsi="Courier New" w:cs="Courier New" w:hint="default"/>
+      </w:rPr>
+    </w:lvl>
+    <w:lvl w:ilvl="2" w:tplc="0C090005">
+      <w:start w:val="1"/>
+      <w:numFmt w:val="bullet"/>
+      <w:lvlText w:val=""/>
+      <w:lvlJc w:val="left"/>
+      <w:pPr>
+        <w:ind w:left="2160" w:hanging="360"/>
+      </w:pPr>
+      <w:rPr>
+        <w:rFonts w:ascii="Wingdings" w:hAnsi="Wingdings" w:hint="default"/>
+      </w:rPr>
+    </w:lvl>
+    <w:lvl w:ilvl="3" w:tplc="0C090001" w:tentative="1">
+      <w:start w:val="1"/>
+      <w:numFmt w:val="bullet"/>
+      <w:lvlText w:val=""/>
+      <w:lvlJc w:val="left"/>
+      <w:pPr>
+        <w:ind w:left="2880" w:hanging="360"/>
+      </w:pPr>
+      <w:rPr>
+        <w:rFonts w:ascii="Symbol" w:hAnsi="Symbol" w:hint="default"/>
+      </w:rPr>
+    </w:lvl>
+    <w:lvl w:ilvl="4" w:tplc="0C090003" w:tentative="1">
+      <w:start w:val="1"/>
+      <w:numFmt w:val="bullet"/>
+      <w:lvlText w:val="o"/>
+      <w:lvlJc w:val="left"/>
+      <w:pPr>
+        <w:ind w:left="3600" w:hanging="360"/>
+      </w:pPr>
+      <w:rPr>
+        <w:rFonts w:ascii="Courier New" w:hAnsi="Courier New" w:cs="Courier New" w:hint="default"/>
+      </w:rPr>
+    </w:lvl>
+    <w:lvl w:ilvl="5" w:tplc="0C090005" w:tentative="1">
+      <w:start w:val="1"/>
+      <w:numFmt w:val="bullet"/>
+      <w:lvlText w:val=""/>
+      <w:lvlJc w:val="left"/>
+      <w:pPr>
+        <w:ind w:left="4320" w:hanging="360"/>
+      </w:pPr>
+      <w:rPr>
+        <w:rFonts w:ascii="Wingdings" w:hAnsi="Wingdings" w:hint="default"/>
+      </w:rPr>
+    </w:lvl>
+    <w:lvl w:ilvl="6" w:tplc="0C090001" w:tentative="1">
+      <w:start w:val="1"/>
+      <w:numFmt w:val="bullet"/>
+      <w:lvlText w:val=""/>
+      <w:lvlJc w:val="left"/>
+      <w:pPr>
+        <w:ind w:left="5040" w:hanging="360"/>
+      </w:pPr>
+      <w:rPr>
+        <w:rFonts w:ascii="Symbol" w:hAnsi="Symbol" w:hint="default"/>
+      </w:rPr>
+    </w:lvl>
+    <w:lvl w:ilvl="7" w:tplc="0C090003" w:tentative="1">
+      <w:start w:val="1"/>
+      <w:numFmt w:val="bullet"/>
+      <w:lvlText w:val="o"/>
+      <w:lvlJc w:val="left"/>
+      <w:pPr>
+        <w:ind w:left="5760" w:hanging="360"/>
+      </w:pPr>
+      <w:rPr>
+        <w:rFonts w:ascii="Courier New" w:hAnsi="Courier New" w:cs="Courier New" w:hint="default"/>
+      </w:rPr>
+    </w:lvl>
+    <w:lvl w:ilvl="8" w:tplc="0C090005" w:tentative="1">
+      <w:start w:val="1"/>
+      <w:numFmt w:val="bullet"/>
+      <w:lvlText w:val=""/>
+      <w:lvlJc w:val="left"/>
+      <w:pPr>
+        <w:ind w:left="6480" w:hanging="360"/>
+      </w:pPr>
+      <w:rPr>
+        <w:rFonts w:ascii="Wingdings" w:hAnsi="Wingdings" w:hint="default"/>
+      </w:rPr>
+    </w:lvl>
+  </w:abstractNum>
+  <w:abstractNum w:abstractNumId="5" w15:restartNumberingAfterBreak="0">
     <w:nsid w:val="34C22EBD"/>
     <w:multiLevelType w:val="hybridMultilevel"/>
     <w:tmpl w:val="83E0A25C"/>
@@ -15821,7 +16590,7 @@
       </w:rPr>
     </w:lvl>
   </w:abstractNum>
-  <w:abstractNum w:abstractNumId="5" w15:restartNumberingAfterBreak="0">
+  <w:abstractNum w:abstractNumId="6" w15:restartNumberingAfterBreak="0">
     <w:nsid w:val="444F48F2"/>
     <w:multiLevelType w:val="hybridMultilevel"/>
     <w:tmpl w:val="57E20DAC"/>
@@ -15934,10 +16703,10 @@
       </w:rPr>
     </w:lvl>
   </w:abstractNum>
-  <w:abstractNum w:abstractNumId="6" w15:restartNumberingAfterBreak="0">
-    <w:nsid w:val="472F0F59"/>
+  <w:abstractNum w:abstractNumId="7" w15:restartNumberingAfterBreak="0">
+    <w:nsid w:val="467C3AC8"/>
     <w:multiLevelType w:val="hybridMultilevel"/>
-    <w:tmpl w:val="0C3EEB84"/>
+    <w:tmpl w:val="34562482"/>
     <w:lvl w:ilvl="0" w:tplc="0C090001">
       <w:start w:val="1"/>
       <w:numFmt w:val="bullet"/>
@@ -15962,7 +16731,7 @@
         <w:rFonts w:ascii="Courier New" w:hAnsi="Courier New" w:cs="Courier New" w:hint="default"/>
       </w:rPr>
     </w:lvl>
-    <w:lvl w:ilvl="2" w:tplc="0C090005" w:tentative="1">
+    <w:lvl w:ilvl="2" w:tplc="0C090005">
       <w:start w:val="1"/>
       <w:numFmt w:val="bullet"/>
       <w:lvlText w:val=""/>
@@ -16047,7 +16816,120 @@
       </w:rPr>
     </w:lvl>
   </w:abstractNum>
-  <w:abstractNum w:abstractNumId="7" w15:restartNumberingAfterBreak="0">
+  <w:abstractNum w:abstractNumId="8" w15:restartNumberingAfterBreak="0">
+    <w:nsid w:val="472F0F59"/>
+    <w:multiLevelType w:val="hybridMultilevel"/>
+    <w:tmpl w:val="0C3EEB84"/>
+    <w:lvl w:ilvl="0" w:tplc="0C090001">
+      <w:start w:val="1"/>
+      <w:numFmt w:val="bullet"/>
+      <w:lvlText w:val=""/>
+      <w:lvlJc w:val="left"/>
+      <w:pPr>
+        <w:ind w:left="720" w:hanging="360"/>
+      </w:pPr>
+      <w:rPr>
+        <w:rFonts w:ascii="Symbol" w:hAnsi="Symbol" w:hint="default"/>
+      </w:rPr>
+    </w:lvl>
+    <w:lvl w:ilvl="1" w:tplc="0C090003">
+      <w:start w:val="1"/>
+      <w:numFmt w:val="bullet"/>
+      <w:lvlText w:val="o"/>
+      <w:lvlJc w:val="left"/>
+      <w:pPr>
+        <w:ind w:left="1440" w:hanging="360"/>
+      </w:pPr>
+      <w:rPr>
+        <w:rFonts w:ascii="Courier New" w:hAnsi="Courier New" w:cs="Courier New" w:hint="default"/>
+      </w:rPr>
+    </w:lvl>
+    <w:lvl w:ilvl="2" w:tplc="0C090005" w:tentative="1">
+      <w:start w:val="1"/>
+      <w:numFmt w:val="bullet"/>
+      <w:lvlText w:val=""/>
+      <w:lvlJc w:val="left"/>
+      <w:pPr>
+        <w:ind w:left="2160" w:hanging="360"/>
+      </w:pPr>
+      <w:rPr>
+        <w:rFonts w:ascii="Wingdings" w:hAnsi="Wingdings" w:hint="default"/>
+      </w:rPr>
+    </w:lvl>
+    <w:lvl w:ilvl="3" w:tplc="0C090001" w:tentative="1">
+      <w:start w:val="1"/>
+      <w:numFmt w:val="bullet"/>
+      <w:lvlText w:val=""/>
+      <w:lvlJc w:val="left"/>
+      <w:pPr>
+        <w:ind w:left="2880" w:hanging="360"/>
+      </w:pPr>
+      <w:rPr>
+        <w:rFonts w:ascii="Symbol" w:hAnsi="Symbol" w:hint="default"/>
+      </w:rPr>
+    </w:lvl>
+    <w:lvl w:ilvl="4" w:tplc="0C090003" w:tentative="1">
+      <w:start w:val="1"/>
+      <w:numFmt w:val="bullet"/>
+      <w:lvlText w:val="o"/>
+      <w:lvlJc w:val="left"/>
+      <w:pPr>
+        <w:ind w:left="3600" w:hanging="360"/>
+      </w:pPr>
+      <w:rPr>
+        <w:rFonts w:ascii="Courier New" w:hAnsi="Courier New" w:cs="Courier New" w:hint="default"/>
+      </w:rPr>
+    </w:lvl>
+    <w:lvl w:ilvl="5" w:tplc="0C090005" w:tentative="1">
+      <w:start w:val="1"/>
+      <w:numFmt w:val="bullet"/>
+      <w:lvlText w:val=""/>
+      <w:lvlJc w:val="left"/>
+      <w:pPr>
+        <w:ind w:left="4320" w:hanging="360"/>
+      </w:pPr>
+      <w:rPr>
+        <w:rFonts w:ascii="Wingdings" w:hAnsi="Wingdings" w:hint="default"/>
+      </w:rPr>
+    </w:lvl>
+    <w:lvl w:ilvl="6" w:tplc="0C090001" w:tentative="1">
+      <w:start w:val="1"/>
+      <w:numFmt w:val="bullet"/>
+      <w:lvlText w:val=""/>
+      <w:lvlJc w:val="left"/>
+      <w:pPr>
+        <w:ind w:left="5040" w:hanging="360"/>
+      </w:pPr>
+      <w:rPr>
+        <w:rFonts w:ascii="Symbol" w:hAnsi="Symbol" w:hint="default"/>
+      </w:rPr>
+    </w:lvl>
+    <w:lvl w:ilvl="7" w:tplc="0C090003" w:tentative="1">
+      <w:start w:val="1"/>
+      <w:numFmt w:val="bullet"/>
+      <w:lvlText w:val="o"/>
+      <w:lvlJc w:val="left"/>
+      <w:pPr>
+        <w:ind w:left="5760" w:hanging="360"/>
+      </w:pPr>
+      <w:rPr>
+        <w:rFonts w:ascii="Courier New" w:hAnsi="Courier New" w:cs="Courier New" w:hint="default"/>
+      </w:rPr>
+    </w:lvl>
+    <w:lvl w:ilvl="8" w:tplc="0C090005" w:tentative="1">
+      <w:start w:val="1"/>
+      <w:numFmt w:val="bullet"/>
+      <w:lvlText w:val=""/>
+      <w:lvlJc w:val="left"/>
+      <w:pPr>
+        <w:ind w:left="6480" w:hanging="360"/>
+      </w:pPr>
+      <w:rPr>
+        <w:rFonts w:ascii="Wingdings" w:hAnsi="Wingdings" w:hint="default"/>
+      </w:rPr>
+    </w:lvl>
+  </w:abstractNum>
+  <w:abstractNum w:abstractNumId="9" w15:restartNumberingAfterBreak="0">
     <w:nsid w:val="4DD0609D"/>
     <w:multiLevelType w:val="hybridMultilevel"/>
     <w:tmpl w:val="54A6E4BE"/>
@@ -16160,7 +17042,7 @@
       </w:rPr>
     </w:lvl>
   </w:abstractNum>
-  <w:abstractNum w:abstractNumId="8" w15:restartNumberingAfterBreak="0">
+  <w:abstractNum w:abstractNumId="10" w15:restartNumberingAfterBreak="0">
     <w:nsid w:val="4EFF5BF2"/>
     <w:multiLevelType w:val="hybridMultilevel"/>
     <w:tmpl w:val="58008AA6"/>
@@ -16273,7 +17155,7 @@
       </w:rPr>
     </w:lvl>
   </w:abstractNum>
-  <w:abstractNum w:abstractNumId="9" w15:restartNumberingAfterBreak="0">
+  <w:abstractNum w:abstractNumId="11" w15:restartNumberingAfterBreak="0">
     <w:nsid w:val="78F7725E"/>
     <w:multiLevelType w:val="hybridMultilevel"/>
     <w:tmpl w:val="93407C9A"/>
@@ -16386,7 +17268,7 @@
       </w:rPr>
     </w:lvl>
   </w:abstractNum>
-  <w:abstractNum w:abstractNumId="10" w15:restartNumberingAfterBreak="0">
+  <w:abstractNum w:abstractNumId="12" w15:restartNumberingAfterBreak="0">
     <w:nsid w:val="7EFB46D0"/>
     <w:multiLevelType w:val="hybridMultilevel"/>
     <w:tmpl w:val="AB50B2BA"/>
@@ -16503,33 +17385,39 @@
     <w:abstractNumId w:val="0"/>
   </w:num>
   <w:num w:numId="2" w16cid:durableId="2113089560">
-    <w:abstractNumId w:val="6"/>
+    <w:abstractNumId w:val="8"/>
   </w:num>
   <w:num w:numId="3" w16cid:durableId="758673523">
-    <w:abstractNumId w:val="5"/>
+    <w:abstractNumId w:val="6"/>
   </w:num>
   <w:num w:numId="4" w16cid:durableId="509294068">
     <w:abstractNumId w:val="2"/>
   </w:num>
   <w:num w:numId="5" w16cid:durableId="1139498544">
+    <w:abstractNumId w:val="5"/>
+  </w:num>
+  <w:num w:numId="6" w16cid:durableId="1379625172">
+    <w:abstractNumId w:val="10"/>
+  </w:num>
+  <w:num w:numId="7" w16cid:durableId="1955401534">
+    <w:abstractNumId w:val="12"/>
+  </w:num>
+  <w:num w:numId="8" w16cid:durableId="1804496243">
     <w:abstractNumId w:val="4"/>
   </w:num>
-  <w:num w:numId="6" w16cid:durableId="1379625172">
-    <w:abstractNumId w:val="8"/>
-  </w:num>
-  <w:num w:numId="7" w16cid:durableId="1955401534">
-    <w:abstractNumId w:val="10"/>
-  </w:num>
-  <w:num w:numId="8" w16cid:durableId="1804496243">
-    <w:abstractNumId w:val="3"/>
-  </w:num>
   <w:num w:numId="9" w16cid:durableId="1496726374">
-    <w:abstractNumId w:val="9"/>
+    <w:abstractNumId w:val="11"/>
   </w:num>
   <w:num w:numId="10" w16cid:durableId="1628779223">
     <w:abstractNumId w:val="1"/>
   </w:num>
   <w:num w:numId="11" w16cid:durableId="1500005552">
+    <w:abstractNumId w:val="9"/>
+  </w:num>
+  <w:num w:numId="12" w16cid:durableId="376126385">
+    <w:abstractNumId w:val="3"/>
+  </w:num>
+  <w:num w:numId="13" w16cid:durableId="1098211502">
     <w:abstractNumId w:val="7"/>
   </w:num>
 </w:numbering>
@@ -17140,6 +18028,7 @@
   <w:style w:type="character" w:default="1" w:styleId="DefaultParagraphFont">
     <w:name w:val="Default Paragraph Font"/>
     <w:uiPriority w:val="1"/>
+    <w:semiHidden/>
     <w:unhideWhenUsed/>
   </w:style>
   <w:style w:type="table" w:default="1" w:styleId="TableNormal">
@@ -17764,16 +18653,6 @@
 </file>
 
 <file path=customXml/item1.xml><?xml version="1.0" encoding="utf-8"?>
-<p:properties xmlns:p="http://schemas.microsoft.com/office/2006/metadata/properties" xmlns:xsi="http://www.w3.org/2001/XMLSchema-instance" xmlns:pc="http://schemas.microsoft.com/office/infopath/2007/PartnerControls">
-  <documentManagement>
-    <lcf76f155ced4ddcb4097134ff3c332f xmlns="3dd856b2-d56d-4f84-9524-b62a7cfc0ae8">
-      <Terms xmlns="http://schemas.microsoft.com/office/infopath/2007/PartnerControls"/>
-    </lcf76f155ced4ddcb4097134ff3c332f>
-  </documentManagement>
-</p:properties>
-</file>
-
-<file path=customXml/item2.xml><?xml version="1.0" encoding="utf-8"?>
 <ct:contentTypeSchema xmlns:ct="http://schemas.microsoft.com/office/2006/metadata/contentType" xmlns:ma="http://schemas.microsoft.com/office/2006/metadata/properties/metaAttributes" ct:_="" ma:_="" ma:contentTypeName="Document" ma:contentTypeID="0x010100FC02EF70122D4443B8FF7DF60A4D9334" ma:contentTypeVersion="14" ma:contentTypeDescription="Create a new document." ma:contentTypeScope="" ma:versionID="d7c083d413a490194e08aafad433b1bf">
   <xsd:schema xmlns:xsd="http://www.w3.org/2001/XMLSchema" xmlns:xs="http://www.w3.org/2001/XMLSchema" xmlns:p="http://schemas.microsoft.com/office/2006/metadata/properties" xmlns:ns2="3dd856b2-d56d-4f84-9524-b62a7cfc0ae8" xmlns:ns3="a94221e4-4c52-49f4-9329-a9192b000179" targetNamespace="http://schemas.microsoft.com/office/2006/metadata/properties" ma:root="true" ma:fieldsID="2d2c0865f1c9c001aec73838d5e6e9cb" ns2:_="" ns3:_="">
     <xsd:import namespace="3dd856b2-d56d-4f84-9524-b62a7cfc0ae8"/>
@@ -17996,7 +18875,7 @@
 </ct:contentTypeSchema>
 </file>
 
-<file path=customXml/item3.xml><?xml version="1.0" encoding="utf-8"?>
+<file path=customXml/item2.xml><?xml version="1.0" encoding="utf-8"?>
 <?mso-contentType ?>
 <FormTemplates xmlns="http://schemas.microsoft.com/sharepoint/v3/contenttype/forms">
   <Display>DocumentLibraryForm</Display>
@@ -18005,17 +18884,17 @@
 </FormTemplates>
 </file>
 
-<file path=customXml/itemProps1.xml><?xml version="1.0" encoding="utf-8"?>
-<ds:datastoreItem xmlns:ds="http://schemas.openxmlformats.org/officeDocument/2006/customXml" ds:itemID="{DEDEAEFB-68EA-415D-B20C-6959D1E9B112}">
-  <ds:schemaRefs>
-    <ds:schemaRef ds:uri="http://schemas.microsoft.com/office/2006/metadata/properties"/>
-    <ds:schemaRef ds:uri="http://schemas.microsoft.com/office/infopath/2007/PartnerControls"/>
-    <ds:schemaRef ds:uri="3dd856b2-d56d-4f84-9524-b62a7cfc0ae8"/>
-  </ds:schemaRefs>
-</ds:datastoreItem>
+<file path=customXml/item3.xml><?xml version="1.0" encoding="utf-8"?>
+<p:properties xmlns:p="http://schemas.microsoft.com/office/2006/metadata/properties" xmlns:xsi="http://www.w3.org/2001/XMLSchema-instance" xmlns:pc="http://schemas.microsoft.com/office/infopath/2007/PartnerControls">
+  <documentManagement>
+    <lcf76f155ced4ddcb4097134ff3c332f xmlns="3dd856b2-d56d-4f84-9524-b62a7cfc0ae8">
+      <Terms xmlns="http://schemas.microsoft.com/office/infopath/2007/PartnerControls"/>
+    </lcf76f155ced4ddcb4097134ff3c332f>
+  </documentManagement>
+</p:properties>
 </file>
 
-<file path=customXml/itemProps2.xml><?xml version="1.0" encoding="utf-8"?>
+<file path=customXml/itemProps1.xml><?xml version="1.0" encoding="utf-8"?>
 <ds:datastoreItem xmlns:ds="http://schemas.openxmlformats.org/officeDocument/2006/customXml" ds:itemID="{F9BA005F-2FCD-4A22-A258-D1B04570E938}">
   <ds:schemaRefs>
     <ds:schemaRef ds:uri="http://schemas.microsoft.com/office/2006/metadata/contentType"/>
@@ -18034,10 +18913,20 @@
 </ds:datastoreItem>
 </file>
 
-<file path=customXml/itemProps3.xml><?xml version="1.0" encoding="utf-8"?>
+<file path=customXml/itemProps2.xml><?xml version="1.0" encoding="utf-8"?>
 <ds:datastoreItem xmlns:ds="http://schemas.openxmlformats.org/officeDocument/2006/customXml" ds:itemID="{A6C3EB43-E9A0-4400-B67F-01DBBB3D5870}">
   <ds:schemaRefs>
     <ds:schemaRef ds:uri="http://schemas.microsoft.com/sharepoint/v3/contenttype/forms"/>
   </ds:schemaRefs>
 </ds:datastoreItem>
+</file>
+
+<file path=customXml/itemProps3.xml><?xml version="1.0" encoding="utf-8"?>
+<ds:datastoreItem xmlns:ds="http://schemas.openxmlformats.org/officeDocument/2006/customXml" ds:itemID="{DEDEAEFB-68EA-415D-B20C-6959D1E9B112}">
+  <ds:schemaRefs>
+    <ds:schemaRef ds:uri="http://schemas.microsoft.com/office/2006/metadata/properties"/>
+    <ds:schemaRef ds:uri="http://schemas.microsoft.com/office/infopath/2007/PartnerControls"/>
+    <ds:schemaRef ds:uri="3dd856b2-d56d-4f84-9524-b62a7cfc0ae8"/>
+  </ds:schemaRefs>
+</ds:datastoreItem>
 </file>
</xml_diff>